<commit_message>
Add realistic project showcases
</commit_message>
<xml_diff>
--- a/deliverables/John-Swaroop-Resume.docx
+++ b/deliverables/John-Swaroop-Resume.docx
@@ -680,15 +680,15 @@
             <w:tcW w:type="dxa" w:w="5004"/>
             <w:shd w:fill="F4F2ED"/>
             <w:tcMar>
-              <w:top w:w="150" w:type="dxa"/>
-              <w:start w:w="150" w:type="dxa"/>
-              <w:bottom w:w="150" w:type="dxa"/>
-              <w:end w:w="150" w:type="dxa"/>
+              <w:top w:w="105" w:type="dxa"/>
+              <w:start w:w="125" w:type="dxa"/>
+              <w:bottom w:w="105" w:type="dxa"/>
+              <w:end w:w="125" w:type="dxa"/>
             </w:tcMar>
           </w:tcPr>
           <w:p>
             <w:pPr>
-              <w:spacing w:after="100"/>
+              <w:spacing w:after="60"/>
             </w:pPr>
             <w:r>
               <w:rPr>
@@ -701,36 +701,36 @@
           </w:p>
           <w:p>
             <w:pPr>
-              <w:spacing w:after="120"/>
+              <w:spacing w:after="80"/>
             </w:pPr>
             <w:r>
               <w:rPr>
                 <w:rFonts w:ascii="Georgia" w:hAnsi="Georgia"/>
                 <w:b/>
-                <w:sz w:val="24"/>
+                <w:sz w:val="21"/>
               </w:rPr>
               <w:t>3D Garden &amp; Home Designer</w:t>
             </w:r>
           </w:p>
           <w:p>
             <w:pPr>
-              <w:spacing w:after="100" w:line="259" w:lineRule="auto"/>
+              <w:spacing w:after="60" w:line="247" w:lineRule="auto"/>
             </w:pPr>
             <w:r>
               <w:rPr>
-                <w:sz w:val="17"/>
+                <w:sz w:val="16"/>
               </w:rPr>
               <w:t>A visual product that helps users create polished 3D garden and home mockups through an approachable design workflow.</w:t>
             </w:r>
           </w:p>
           <w:p>
             <w:pPr>
-              <w:spacing w:after="0" w:line="259" w:lineRule="auto"/>
+              <w:spacing w:after="0" w:line="247" w:lineRule="auto"/>
             </w:pPr>
             <w:r>
               <w:rPr>
                 <w:color w:val="53554F"/>
-                <w:sz w:val="16"/>
+                <w:sz w:val="15"/>
               </w:rPr>
               <w:t>Worked across the interactive product experience and supporting platform, helping translate specialist 3D-design concepts into a tool for everyday users.</w:t>
             </w:r>
@@ -741,15 +741,15 @@
             <w:tcW w:type="dxa" w:w="5004"/>
             <w:shd w:fill="F4F2ED"/>
             <w:tcMar>
-              <w:top w:w="150" w:type="dxa"/>
-              <w:start w:w="150" w:type="dxa"/>
-              <w:bottom w:w="150" w:type="dxa"/>
-              <w:end w:w="150" w:type="dxa"/>
+              <w:top w:w="105" w:type="dxa"/>
+              <w:start w:w="125" w:type="dxa"/>
+              <w:bottom w:w="105" w:type="dxa"/>
+              <w:end w:w="125" w:type="dxa"/>
             </w:tcMar>
           </w:tcPr>
           <w:p>
             <w:pPr>
-              <w:spacing w:after="100"/>
+              <w:spacing w:after="60"/>
             </w:pPr>
             <w:r>
               <w:rPr>
@@ -762,38 +762,162 @@
           </w:p>
           <w:p>
             <w:pPr>
-              <w:spacing w:after="120"/>
+              <w:spacing w:after="80"/>
             </w:pPr>
             <w:r>
               <w:rPr>
                 <w:rFonts w:ascii="Georgia" w:hAnsi="Georgia"/>
                 <w:b/>
-                <w:sz w:val="24"/>
+                <w:sz w:val="21"/>
               </w:rPr>
               <w:t>Krooki Management System</w:t>
             </w:r>
           </w:p>
           <w:p>
             <w:pPr>
-              <w:spacing w:after="100" w:line="259" w:lineRule="auto"/>
+              <w:spacing w:after="60" w:line="247" w:lineRule="auto"/>
             </w:pPr>
             <w:r>
               <w:rPr>
-                <w:sz w:val="17"/>
+                <w:sz w:val="16"/>
               </w:rPr>
               <w:t>A management platform supporting the Government of Oman in digitizing construction application and approval processes.</w:t>
             </w:r>
           </w:p>
           <w:p>
             <w:pPr>
-              <w:spacing w:after="0" w:line="259" w:lineRule="auto"/>
+              <w:spacing w:after="0" w:line="247" w:lineRule="auto"/>
             </w:pPr>
             <w:r>
               <w:rPr>
                 <w:color w:val="53554F"/>
+                <w:sz w:val="15"/>
+              </w:rPr>
+              <w:t>Helped turn a multi-stage operational process into a structured digital workflow for application management, reviews, approvals and stakeholder coordination.</w:t>
+            </w:r>
+          </w:p>
+        </w:tc>
+      </w:tr>
+      <w:tr>
+        <w:tc>
+          <w:tcPr>
+            <w:tcW w:type="dxa" w:w="5004"/>
+            <w:shd w:fill="F4F2ED"/>
+            <w:tcMar>
+              <w:top w:w="105" w:type="dxa"/>
+              <w:start w:w="125" w:type="dxa"/>
+              <w:bottom w:w="105" w:type="dxa"/>
+              <w:end w:w="125" w:type="dxa"/>
+            </w:tcMar>
+          </w:tcPr>
+          <w:p>
+            <w:pPr>
+              <w:spacing w:after="60"/>
+            </w:pPr>
+            <w:r>
+              <w:rPr>
+                <w:b/>
+                <w:color w:val="6354E8"/>
+                <w:sz w:val="14"/>
+              </w:rPr>
+              <w:t>APPLIED AI · REALTIME VOICE</w:t>
+            </w:r>
+          </w:p>
+          <w:p>
+            <w:pPr>
+              <w:spacing w:after="80"/>
+            </w:pPr>
+            <w:r>
+              <w:rPr>
+                <w:rFonts w:ascii="Georgia" w:hAnsi="Georgia"/>
+                <w:b/>
+                <w:sz w:val="21"/>
+              </w:rPr>
+              <w:t>Interview Practice &amp; Screening Platform</w:t>
+            </w:r>
+          </w:p>
+          <w:p>
+            <w:pPr>
+              <w:spacing w:after="60" w:line="247" w:lineRule="auto"/>
+            </w:pPr>
+            <w:r>
+              <w:rPr>
                 <w:sz w:val="16"/>
               </w:rPr>
-              <w:t>Helped turn a multi-stage operational process into a structured digital workflow for application management, reviews, approvals and stakeholder coordination.</w:t>
+              <w:t>An AI-powered voice platform for realistic interview practice and structured candidate screening.</w:t>
+            </w:r>
+          </w:p>
+          <w:p>
+            <w:pPr>
+              <w:spacing w:after="0" w:line="247" w:lineRule="auto"/>
+            </w:pPr>
+            <w:r>
+              <w:rPr>
+                <w:color w:val="53554F"/>
+                <w:sz w:val="15"/>
+              </w:rPr>
+              <w:t>Built end-to-end across question generation, live voice conversations, session management, evaluation and actionable feedback.</w:t>
+            </w:r>
+          </w:p>
+        </w:tc>
+        <w:tc>
+          <w:tcPr>
+            <w:tcW w:type="dxa" w:w="5004"/>
+            <w:shd w:fill="F4F2ED"/>
+            <w:tcMar>
+              <w:top w:w="105" w:type="dxa"/>
+              <w:start w:w="125" w:type="dxa"/>
+              <w:bottom w:w="105" w:type="dxa"/>
+              <w:end w:w="125" w:type="dxa"/>
+            </w:tcMar>
+          </w:tcPr>
+          <w:p>
+            <w:pPr>
+              <w:spacing w:after="60"/>
+            </w:pPr>
+            <w:r>
+              <w:rPr>
+                <w:b/>
+                <w:color w:val="6354E8"/>
+                <w:sz w:val="14"/>
+              </w:rPr>
+              <w:t>DEALER ERP · COMMERCE PLATFORM</w:t>
+            </w:r>
+          </w:p>
+          <w:p>
+            <w:pPr>
+              <w:spacing w:after="80"/>
+            </w:pPr>
+            <w:r>
+              <w:rPr>
+                <w:rFonts w:ascii="Georgia" w:hAnsi="Georgia"/>
+                <w:b/>
+                <w:sz w:val="21"/>
+              </w:rPr>
+              <w:t>Used-Car Dealer ERP</w:t>
+            </w:r>
+          </w:p>
+          <w:p>
+            <w:pPr>
+              <w:spacing w:after="60" w:line="247" w:lineRule="auto"/>
+            </w:pPr>
+            <w:r>
+              <w:rPr>
+                <w:sz w:val="16"/>
+              </w:rPr>
+              <w:t>An end-to-end operating system combining vehicle inventory, lead management and a customizable customer-facing storefront.</w:t>
+            </w:r>
+          </w:p>
+          <w:p>
+            <w:pPr>
+              <w:spacing w:after="0" w:line="247" w:lineRule="auto"/>
+            </w:pPr>
+            <w:r>
+              <w:rPr>
+                <w:color w:val="53554F"/>
+                <w:sz w:val="15"/>
+              </w:rPr>
+              <w:t>Built automated storefront generation, lead capture and pipelines, dealer branding and merchandising controls across the full stack.</w:t>
             </w:r>
           </w:p>
         </w:tc>
@@ -1131,7 +1255,7 @@
                 <w:b/>
                 <w:sz w:val="17"/>
               </w:rPr>
-              <w:t>AI interview systems</w:t>
+              <w:t>Workflow agents &amp; automation</w:t>
             </w:r>
           </w:p>
           <w:p>
@@ -1143,7 +1267,7 @@
                 <w:color w:val="53554F"/>
                 <w:sz w:val="16"/>
               </w:rPr>
-              <w:t>Interview and screening products spanning question generation, response analysis, scoring, evaluation and video-introduction assessment.</w:t>
+              <w:t>Knowledge-grounded, tool-enabled agents with multi-turn state, configurable workflows, external actions and human review.</w:t>
             </w:r>
           </w:p>
         </w:tc>
@@ -1167,7 +1291,7 @@
                 <w:b/>
                 <w:sz w:val="17"/>
               </w:rPr>
-              <w:t>Chatbots &amp; workflow agents</w:t>
+              <w:t>Document intelligence pipelines</w:t>
             </w:r>
           </w:p>
           <w:p>
@@ -1179,7 +1303,7 @@
                 <w:color w:val="53554F"/>
                 <w:sz w:val="16"/>
               </w:rPr>
-              <w:t>Knowledge-grounded, tool-enabled experiences with multi-turn state, external actions, configurable workflows and customer-support automation.</w:t>
+              <w:t>Document ingestion, extraction, hierarchy-aware indexing, retrieval and structured analysis across complex files.</w:t>
             </w:r>
           </w:p>
         </w:tc>

</xml_diff>